<commit_message>
Réorganisation du dépôt : structure en dossiers (src, config, powerbi, reports)
</commit_message>
<xml_diff>
--- a/reports/rapport__groupe10.docx
+++ b/reports/rapport__groupe10.docx
@@ -74,12 +74,6 @@
         <w:gridCol w:w="6438"/>
       </w:tblGrid>
       <w:tr>
-        <w:tblPrEx>
-          <w:tblCellMar>
-            <w:top w:w="0" w:type="dxa"/>
-            <w:bottom w:w="0" w:type="dxa"/>
-          </w:tblCellMar>
-        </w:tblPrEx>
         <w:tc>
           <w:tcPr>
             <w:tcW w:w="3200" w:type="dxa"/>
@@ -116,18 +110,12 @@
               <w:t xml:space="preserve">Groupe </w:t>
             </w:r>
             <w:r>
-              <w:t>4</w:t>
+              <w:t>10</w:t>
             </w:r>
           </w:p>
         </w:tc>
       </w:tr>
       <w:tr>
-        <w:tblPrEx>
-          <w:tblCellMar>
-            <w:top w:w="0" w:type="dxa"/>
-            <w:bottom w:w="0" w:type="dxa"/>
-          </w:tblCellMar>
-        </w:tblPrEx>
         <w:tc>
           <w:tcPr>
             <w:tcW w:w="3200" w:type="dxa"/>
@@ -173,12 +161,6 @@
         </w:tc>
       </w:tr>
       <w:tr>
-        <w:tblPrEx>
-          <w:tblCellMar>
-            <w:top w:w="0" w:type="dxa"/>
-            <w:bottom w:w="0" w:type="dxa"/>
-          </w:tblCellMar>
-        </w:tblPrEx>
         <w:tc>
           <w:tcPr>
             <w:tcW w:w="3200" w:type="dxa"/>
@@ -218,12 +200,6 @@
         </w:tc>
       </w:tr>
       <w:tr>
-        <w:tblPrEx>
-          <w:tblCellMar>
-            <w:top w:w="0" w:type="dxa"/>
-            <w:bottom w:w="0" w:type="dxa"/>
-          </w:tblCellMar>
-        </w:tblPrEx>
         <w:tc>
           <w:tcPr>
             <w:tcW w:w="3200" w:type="dxa"/>
@@ -263,12 +239,6 @@
         </w:tc>
       </w:tr>
       <w:tr>
-        <w:tblPrEx>
-          <w:tblCellMar>
-            <w:top w:w="0" w:type="dxa"/>
-            <w:bottom w:w="0" w:type="dxa"/>
-          </w:tblCellMar>
-        </w:tblPrEx>
         <w:tc>
           <w:tcPr>
             <w:tcW w:w="3200" w:type="dxa"/>
@@ -308,12 +278,6 @@
         </w:tc>
       </w:tr>
       <w:tr>
-        <w:tblPrEx>
-          <w:tblCellMar>
-            <w:top w:w="0" w:type="dxa"/>
-            <w:bottom w:w="0" w:type="dxa"/>
-          </w:tblCellMar>
-        </w:tblPrEx>
         <w:tc>
           <w:tcPr>
             <w:tcW w:w="3200" w:type="dxa"/>
@@ -660,6 +624,9 @@
         <w:spacing w:after="180"/>
       </w:pPr>
       <w:r>
+        <w:rPr>
+          <w:noProof/>
+        </w:rPr>
         <w:lastRenderedPageBreak/>
         <w:drawing>
           <wp:inline distT="0" distB="0" distL="0" distR="0" wp14:anchorId="44805FFC" wp14:editId="460DD255">
@@ -749,12 +716,6 @@
         <w:gridCol w:w="6438"/>
       </w:tblGrid>
       <w:tr>
-        <w:tblPrEx>
-          <w:tblCellMar>
-            <w:top w:w="0" w:type="dxa"/>
-            <w:bottom w:w="0" w:type="dxa"/>
-          </w:tblCellMar>
-        </w:tblPrEx>
         <w:trPr>
           <w:tblHeader/>
         </w:trPr>
@@ -804,12 +765,6 @@
         </w:tc>
       </w:tr>
       <w:tr>
-        <w:tblPrEx>
-          <w:tblCellMar>
-            <w:top w:w="0" w:type="dxa"/>
-            <w:bottom w:w="0" w:type="dxa"/>
-          </w:tblCellMar>
-        </w:tblPrEx>
         <w:tc>
           <w:tcPr>
             <w:tcW w:w="3200" w:type="dxa"/>
@@ -849,12 +804,6 @@
         </w:tc>
       </w:tr>
       <w:tr>
-        <w:tblPrEx>
-          <w:tblCellMar>
-            <w:top w:w="0" w:type="dxa"/>
-            <w:bottom w:w="0" w:type="dxa"/>
-          </w:tblCellMar>
-        </w:tblPrEx>
         <w:tc>
           <w:tcPr>
             <w:tcW w:w="3200" w:type="dxa"/>
@@ -894,12 +843,6 @@
         </w:tc>
       </w:tr>
       <w:tr>
-        <w:tblPrEx>
-          <w:tblCellMar>
-            <w:top w:w="0" w:type="dxa"/>
-            <w:bottom w:w="0" w:type="dxa"/>
-          </w:tblCellMar>
-        </w:tblPrEx>
         <w:tc>
           <w:tcPr>
             <w:tcW w:w="3200" w:type="dxa"/>
@@ -939,12 +882,6 @@
         </w:tc>
       </w:tr>
       <w:tr>
-        <w:tblPrEx>
-          <w:tblCellMar>
-            <w:top w:w="0" w:type="dxa"/>
-            <w:bottom w:w="0" w:type="dxa"/>
-          </w:tblCellMar>
-        </w:tblPrEx>
         <w:tc>
           <w:tcPr>
             <w:tcW w:w="3200" w:type="dxa"/>
@@ -984,12 +921,6 @@
         </w:tc>
       </w:tr>
       <w:tr>
-        <w:tblPrEx>
-          <w:tblCellMar>
-            <w:top w:w="0" w:type="dxa"/>
-            <w:bottom w:w="0" w:type="dxa"/>
-          </w:tblCellMar>
-        </w:tblPrEx>
         <w:tc>
           <w:tcPr>
             <w:tcW w:w="3200" w:type="dxa"/>
@@ -1029,12 +960,6 @@
         </w:tc>
       </w:tr>
       <w:tr>
-        <w:tblPrEx>
-          <w:tblCellMar>
-            <w:top w:w="0" w:type="dxa"/>
-            <w:bottom w:w="0" w:type="dxa"/>
-          </w:tblCellMar>
-        </w:tblPrEx>
         <w:tc>
           <w:tcPr>
             <w:tcW w:w="3200" w:type="dxa"/>
@@ -1193,6 +1118,9 @@
         <w:spacing w:after="90"/>
       </w:pPr>
       <w:r>
+        <w:rPr>
+          <w:noProof/>
+        </w:rPr>
         <w:lastRenderedPageBreak/>
         <w:drawing>
           <wp:inline distT="0" distB="0" distL="0" distR="0" wp14:anchorId="7DE2676E" wp14:editId="6CDC737B">
@@ -1432,17 +1360,7 @@
           <w:szCs w:val="24"/>
           <w:u w:val="single"/>
         </w:rPr>
-        <w:t>E</w:t>
-      </w:r>
-      <w:r>
-        <w:rPr>
-          <w:b/>
-          <w:bCs/>
-          <w:sz w:val="24"/>
-          <w:szCs w:val="24"/>
-          <w:u w:val="single"/>
-        </w:rPr>
-        <w:t>xécution de « python3 hibp_pipeline.py », montrant les 4 analyses affichées (plus gros breach, évolution par année, types de données, secteurs).</w:t>
+        <w:t>Exécution de « python3 hibp_pipeline.py », montrant les 4 analyses affichées (plus gros breach, évolution par année, types de données, secteurs).</w:t>
       </w:r>
     </w:p>
     <w:p>
@@ -1526,6 +1444,9 @@
         <w:ind w:left="360"/>
       </w:pPr>
       <w:r>
+        <w:rPr>
+          <w:noProof/>
+        </w:rPr>
         <w:drawing>
           <wp:inline distT="0" distB="0" distL="0" distR="0" wp14:anchorId="294587DE" wp14:editId="42875E47">
             <wp:extent cx="5731510" cy="3016250"/>
@@ -1707,6 +1628,9 @@
         <w:ind w:left="360"/>
       </w:pPr>
       <w:r>
+        <w:rPr>
+          <w:noProof/>
+        </w:rPr>
         <w:lastRenderedPageBreak/>
         <w:drawing>
           <wp:inline distT="0" distB="0" distL="0" distR="0" wp14:anchorId="7333F82F" wp14:editId="59CE5D18">
@@ -1820,6 +1744,9 @@
         <w:ind w:left="360"/>
       </w:pPr>
       <w:r>
+        <w:rPr>
+          <w:noProof/>
+        </w:rPr>
         <w:drawing>
           <wp:inline distT="0" distB="0" distL="0" distR="0" wp14:anchorId="346CC65A" wp14:editId="00275D11">
             <wp:extent cx="5731510" cy="2871470"/>
@@ -1991,12 +1918,6 @@
         <w:gridCol w:w="6438"/>
       </w:tblGrid>
       <w:tr>
-        <w:tblPrEx>
-          <w:tblCellMar>
-            <w:top w:w="0" w:type="dxa"/>
-            <w:bottom w:w="0" w:type="dxa"/>
-          </w:tblCellMar>
-        </w:tblPrEx>
         <w:trPr>
           <w:tblHeader/>
         </w:trPr>
@@ -2046,12 +1967,6 @@
         </w:tc>
       </w:tr>
       <w:tr>
-        <w:tblPrEx>
-          <w:tblCellMar>
-            <w:top w:w="0" w:type="dxa"/>
-            <w:bottom w:w="0" w:type="dxa"/>
-          </w:tblCellMar>
-        </w:tblPrEx>
         <w:tc>
           <w:tcPr>
             <w:tcW w:w="3200" w:type="dxa"/>
@@ -2091,12 +2006,6 @@
         </w:tc>
       </w:tr>
       <w:tr>
-        <w:tblPrEx>
-          <w:tblCellMar>
-            <w:top w:w="0" w:type="dxa"/>
-            <w:bottom w:w="0" w:type="dxa"/>
-          </w:tblCellMar>
-        </w:tblPrEx>
         <w:tc>
           <w:tcPr>
             <w:tcW w:w="3200" w:type="dxa"/>
@@ -2136,12 +2045,6 @@
         </w:tc>
       </w:tr>
       <w:tr>
-        <w:tblPrEx>
-          <w:tblCellMar>
-            <w:top w:w="0" w:type="dxa"/>
-            <w:bottom w:w="0" w:type="dxa"/>
-          </w:tblCellMar>
-        </w:tblPrEx>
         <w:tc>
           <w:tcPr>
             <w:tcW w:w="3200" w:type="dxa"/>
@@ -2181,12 +2084,6 @@
         </w:tc>
       </w:tr>
       <w:tr>
-        <w:tblPrEx>
-          <w:tblCellMar>
-            <w:top w:w="0" w:type="dxa"/>
-            <w:bottom w:w="0" w:type="dxa"/>
-          </w:tblCellMar>
-        </w:tblPrEx>
         <w:tc>
           <w:tcPr>
             <w:tcW w:w="3200" w:type="dxa"/>
@@ -2226,12 +2123,6 @@
         </w:tc>
       </w:tr>
       <w:tr>
-        <w:tblPrEx>
-          <w:tblCellMar>
-            <w:top w:w="0" w:type="dxa"/>
-            <w:bottom w:w="0" w:type="dxa"/>
-          </w:tblCellMar>
-        </w:tblPrEx>
         <w:tc>
           <w:tcPr>
             <w:tcW w:w="3200" w:type="dxa"/>
@@ -2271,12 +2162,6 @@
         </w:tc>
       </w:tr>
       <w:tr>
-        <w:tblPrEx>
-          <w:tblCellMar>
-            <w:top w:w="0" w:type="dxa"/>
-            <w:bottom w:w="0" w:type="dxa"/>
-          </w:tblCellMar>
-        </w:tblPrEx>
         <w:tc>
           <w:tcPr>
             <w:tcW w:w="3200" w:type="dxa"/>
@@ -2484,12 +2369,6 @@
         <w:gridCol w:w="6438"/>
       </w:tblGrid>
       <w:tr>
-        <w:tblPrEx>
-          <w:tblCellMar>
-            <w:top w:w="0" w:type="dxa"/>
-            <w:bottom w:w="0" w:type="dxa"/>
-          </w:tblCellMar>
-        </w:tblPrEx>
         <w:trPr>
           <w:tblHeader/>
         </w:trPr>
@@ -2539,12 +2418,6 @@
         </w:tc>
       </w:tr>
       <w:tr>
-        <w:tblPrEx>
-          <w:tblCellMar>
-            <w:top w:w="0" w:type="dxa"/>
-            <w:bottom w:w="0" w:type="dxa"/>
-          </w:tblCellMar>
-        </w:tblPrEx>
         <w:tc>
           <w:tcPr>
             <w:tcW w:w="3200" w:type="dxa"/>
@@ -2584,12 +2457,6 @@
         </w:tc>
       </w:tr>
       <w:tr>
-        <w:tblPrEx>
-          <w:tblCellMar>
-            <w:top w:w="0" w:type="dxa"/>
-            <w:bottom w:w="0" w:type="dxa"/>
-          </w:tblCellMar>
-        </w:tblPrEx>
         <w:tc>
           <w:tcPr>
             <w:tcW w:w="3200" w:type="dxa"/>
@@ -2629,12 +2496,6 @@
         </w:tc>
       </w:tr>
       <w:tr>
-        <w:tblPrEx>
-          <w:tblCellMar>
-            <w:top w:w="0" w:type="dxa"/>
-            <w:bottom w:w="0" w:type="dxa"/>
-          </w:tblCellMar>
-        </w:tblPrEx>
         <w:tc>
           <w:tcPr>
             <w:tcW w:w="3200" w:type="dxa"/>
@@ -2674,12 +2535,6 @@
         </w:tc>
       </w:tr>
       <w:tr>
-        <w:tblPrEx>
-          <w:tblCellMar>
-            <w:top w:w="0" w:type="dxa"/>
-            <w:bottom w:w="0" w:type="dxa"/>
-          </w:tblCellMar>
-        </w:tblPrEx>
         <w:tc>
           <w:tcPr>
             <w:tcW w:w="3200" w:type="dxa"/>
@@ -2719,12 +2574,6 @@
         </w:tc>
       </w:tr>
       <w:tr>
-        <w:tblPrEx>
-          <w:tblCellMar>
-            <w:top w:w="0" w:type="dxa"/>
-            <w:bottom w:w="0" w:type="dxa"/>
-          </w:tblCellMar>
-        </w:tblPrEx>
         <w:tc>
           <w:tcPr>
             <w:tcW w:w="3200" w:type="dxa"/>
@@ -2764,12 +2613,6 @@
         </w:tc>
       </w:tr>
       <w:tr>
-        <w:tblPrEx>
-          <w:tblCellMar>
-            <w:top w:w="0" w:type="dxa"/>
-            <w:bottom w:w="0" w:type="dxa"/>
-          </w:tblCellMar>
-        </w:tblPrEx>
         <w:tc>
           <w:tcPr>
             <w:tcW w:w="3200" w:type="dxa"/>
@@ -2915,12 +2758,6 @@
         <w:gridCol w:w="4507"/>
       </w:tblGrid>
       <w:tr>
-        <w:tblPrEx>
-          <w:tblCellMar>
-            <w:top w:w="0" w:type="dxa"/>
-            <w:bottom w:w="0" w:type="dxa"/>
-          </w:tblCellMar>
-        </w:tblPrEx>
         <w:trPr>
           <w:tblHeader/>
         </w:trPr>
@@ -2970,12 +2807,6 @@
         </w:tc>
       </w:tr>
       <w:tr>
-        <w:tblPrEx>
-          <w:tblCellMar>
-            <w:top w:w="0" w:type="dxa"/>
-            <w:bottom w:w="0" w:type="dxa"/>
-          </w:tblCellMar>
-        </w:tblPrEx>
         <w:tc>
           <w:tcPr>
             <w:tcW w:w="3200" w:type="dxa"/>
@@ -3015,12 +2846,6 @@
         </w:tc>
       </w:tr>
       <w:tr>
-        <w:tblPrEx>
-          <w:tblCellMar>
-            <w:top w:w="0" w:type="dxa"/>
-            <w:bottom w:w="0" w:type="dxa"/>
-          </w:tblCellMar>
-        </w:tblPrEx>
         <w:tc>
           <w:tcPr>
             <w:tcW w:w="3200" w:type="dxa"/>
@@ -3060,12 +2885,6 @@
         </w:tc>
       </w:tr>
       <w:tr>
-        <w:tblPrEx>
-          <w:tblCellMar>
-            <w:top w:w="0" w:type="dxa"/>
-            <w:bottom w:w="0" w:type="dxa"/>
-          </w:tblCellMar>
-        </w:tblPrEx>
         <w:tc>
           <w:tcPr>
             <w:tcW w:w="3200" w:type="dxa"/>
@@ -3105,12 +2924,6 @@
         </w:tc>
       </w:tr>
       <w:tr>
-        <w:tblPrEx>
-          <w:tblCellMar>
-            <w:top w:w="0" w:type="dxa"/>
-            <w:bottom w:w="0" w:type="dxa"/>
-          </w:tblCellMar>
-        </w:tblPrEx>
         <w:tc>
           <w:tcPr>
             <w:tcW w:w="3200" w:type="dxa"/>
@@ -3150,12 +2963,6 @@
         </w:tc>
       </w:tr>
       <w:tr>
-        <w:tblPrEx>
-          <w:tblCellMar>
-            <w:top w:w="0" w:type="dxa"/>
-            <w:bottom w:w="0" w:type="dxa"/>
-          </w:tblCellMar>
-        </w:tblPrEx>
         <w:tc>
           <w:tcPr>
             <w:tcW w:w="3200" w:type="dxa"/>
@@ -3195,12 +3002,6 @@
         </w:tc>
       </w:tr>
       <w:tr>
-        <w:tblPrEx>
-          <w:tblCellMar>
-            <w:top w:w="0" w:type="dxa"/>
-            <w:bottom w:w="0" w:type="dxa"/>
-          </w:tblCellMar>
-        </w:tblPrEx>
         <w:tc>
           <w:tcPr>
             <w:tcW w:w="3200" w:type="dxa"/>
@@ -3325,7 +3126,7 @@
           <w:i/>
           <w:iCs/>
         </w:rPr>
-        <w:t>4</w:t>
+        <w:t>10</w:t>
       </w:r>
     </w:p>
     <w:sectPr>
@@ -3974,6 +3775,7 @@
   <w:style w:type="character" w:default="1" w:styleId="Policepardfaut">
     <w:name w:val="Default Paragraph Font"/>
     <w:uiPriority w:val="1"/>
+    <w:semiHidden/>
     <w:unhideWhenUsed/>
   </w:style>
   <w:style w:type="table" w:default="1" w:styleId="TableauNormal">

</xml_diff>